<commit_message>
Update team list, switch to monochrome theme, add Colab notebook
- Replace project team names with: Yehia Mostafa, Mohamed Nasr,
  Youssef Mohamed, Mahmoud Naser, Ali Eldien (in report.md, شرح_المشروع.md,
  and regenerated report.docx / report.pdf).
- Switch the build_report.py palette to a black-and-white scheme:
  black headings, near-black h2, mid-grey accents, light-grey zebra rows,
  greyscale cover bands.
- Add notebooks/colab_demo.ipynb — self-contained Colab demo that clones
  the repo, installs deps, runs RF + XGB + MLP, and produces the standard
  metrics + plots (confusion matrices, ROC, feature importance).
- Add an "Open in Colab" badge to README.md.

Co-Authored-By: Claude Opus 4.7 (1M context) <noreply@anthropic.com>
</commit_message>
<xml_diff>
--- a/reports/report.docx
+++ b/reports/report.docx
@@ -5,7 +5,7 @@
     <w:p>
       <w:pPr>
         <w:spacing w:before="0" w:after="480"/>
-        <w:shd w:val="clear" w:color="auto" w:fill="134E4A"/>
+        <w:shd w:val="clear" w:color="auto" w:fill="000000"/>
       </w:pPr>
       <w:r>
         <w:rPr>
@@ -27,7 +27,7 @@
           <w:rFonts w:ascii="Arial" w:hAnsi="Arial"/>
           <w:b/>
           <w:i w:val="0"/>
-          <w:color w:val="134E4A"/>
+          <w:color w:val="000000"/>
           <w:sz w:val="56"/>
         </w:rPr>
         <w:t>Network Traffic Attribution under Spoofing and Decoy Attacks: Project Report</w:t>
@@ -43,7 +43,7 @@
           <w:rFonts w:ascii="Arial" w:hAnsi="Arial"/>
           <w:b w:val="0"/>
           <w:i w:val="0"/>
-          <w:color w:val="B45309"/>
+          <w:color w:val="3C3C3C"/>
           <w:sz w:val="28"/>
         </w:rPr>
         <w:t>────────────────────</w:t>
@@ -59,7 +59,7 @@
           <w:rFonts w:ascii="Arial" w:hAnsi="Arial"/>
           <w:b w:val="0"/>
           <w:i/>
-          <w:color w:val="0F766E"/>
+          <w:color w:val="3C3C3C"/>
           <w:sz w:val="32"/>
         </w:rPr>
         <w:t>Digital Forensics</w:t>
@@ -75,7 +75,7 @@
           <w:rFonts w:ascii="Arial" w:hAnsi="Arial"/>
           <w:b w:val="0"/>
           <w:i/>
-          <w:color w:val="0F766E"/>
+          <w:color w:val="3C3C3C"/>
           <w:sz w:val="26"/>
         </w:rPr>
         <w:t>Project Report</w:t>
@@ -91,7 +91,7 @@
           <w:rFonts w:ascii="Arial" w:hAnsi="Arial"/>
           <w:b/>
           <w:i w:val="0"/>
-          <w:color w:val="B45309"/>
+          <w:color w:val="3C3C3C"/>
           <w:sz w:val="22"/>
         </w:rPr>
         <w:t>Submitted to</w:t>
@@ -107,7 +107,7 @@
           <w:rFonts w:ascii="Arial" w:hAnsi="Arial"/>
           <w:b/>
           <w:i w:val="0"/>
-          <w:color w:val="282828"/>
+          <w:color w:val="0F0F0F"/>
           <w:sz w:val="28"/>
         </w:rPr>
         <w:t>Dr. Hassan Ibrahim</w:t>
@@ -123,7 +123,7 @@
           <w:rFonts w:ascii="Arial" w:hAnsi="Arial"/>
           <w:b/>
           <w:i w:val="0"/>
-          <w:color w:val="B45309"/>
+          <w:color w:val="3C3C3C"/>
           <w:sz w:val="22"/>
         </w:rPr>
         <w:t>Date</w:t>
@@ -139,7 +139,7 @@
           <w:rFonts w:ascii="Arial" w:hAnsi="Arial"/>
           <w:b w:val="0"/>
           <w:i w:val="0"/>
-          <w:color w:val="282828"/>
+          <w:color w:val="0F0F0F"/>
           <w:sz w:val="26"/>
         </w:rPr>
         <w:t>14 May 2026</w:t>
@@ -155,7 +155,7 @@
           <w:rFonts w:ascii="Arial" w:hAnsi="Arial"/>
           <w:b/>
           <w:i w:val="0"/>
-          <w:color w:val="0F766E"/>
+          <w:color w:val="141414"/>
           <w:sz w:val="28"/>
         </w:rPr>
         <w:t>Project Team</w:t>
@@ -171,10 +171,10 @@
           <w:rFonts w:ascii="Arial" w:hAnsi="Arial"/>
           <w:b w:val="0"/>
           <w:i w:val="0"/>
-          <w:color w:val="282828"/>
+          <w:color w:val="0F0F0F"/>
           <w:sz w:val="24"/>
         </w:rPr>
-        <w:t>1.   Momen Mohamed Sharkawi</w:t>
+        <w:t>1.   Yehia Mostafa</w:t>
       </w:r>
     </w:p>
     <w:p>
@@ -187,10 +187,10 @@
           <w:rFonts w:ascii="Arial" w:hAnsi="Arial"/>
           <w:b w:val="0"/>
           <w:i w:val="0"/>
-          <w:color w:val="282828"/>
+          <w:color w:val="0F0F0F"/>
           <w:sz w:val="24"/>
         </w:rPr>
-        <w:t>2.   Omar Hassan Ibrahim</w:t>
+        <w:t>2.   Mohamed Nasr</w:t>
       </w:r>
     </w:p>
     <w:p>
@@ -203,10 +203,10 @@
           <w:rFonts w:ascii="Arial" w:hAnsi="Arial"/>
           <w:b w:val="0"/>
           <w:i w:val="0"/>
-          <w:color w:val="282828"/>
+          <w:color w:val="0F0F0F"/>
           <w:sz w:val="24"/>
         </w:rPr>
-        <w:t>3.   Ahmed Yusri Abd Elmoneim</w:t>
+        <w:t>3.   Youssef Mohamed</w:t>
       </w:r>
     </w:p>
     <w:p>
@@ -219,10 +219,10 @@
           <w:rFonts w:ascii="Arial" w:hAnsi="Arial"/>
           <w:b w:val="0"/>
           <w:i w:val="0"/>
-          <w:color w:val="282828"/>
+          <w:color w:val="0F0F0F"/>
           <w:sz w:val="24"/>
         </w:rPr>
-        <w:t>4.   Abd Elrahman Ahmed Fathy</w:t>
+        <w:t>4.   Mahmoud Naser</w:t>
       </w:r>
     </w:p>
     <w:p>
@@ -235,17 +235,17 @@
           <w:rFonts w:ascii="Arial" w:hAnsi="Arial"/>
           <w:b w:val="0"/>
           <w:i w:val="0"/>
-          <w:color w:val="282828"/>
+          <w:color w:val="0F0F0F"/>
           <w:sz w:val="24"/>
         </w:rPr>
-        <w:t>5.   Marwan Ramdan</w:t>
+        <w:t>5.   Ali Eldien</w:t>
       </w:r>
     </w:p>
     <w:p/>
     <w:p/>
     <w:p>
       <w:pPr>
-        <w:shd w:val="clear" w:color="auto" w:fill="B45309"/>
+        <w:shd w:val="clear" w:color="auto" w:fill="3C3C3C"/>
       </w:pPr>
       <w:r>
         <w:rPr>
@@ -265,7 +265,7 @@
       </w:pPr>
       <w:r>
         <w:rPr>
-          <w:color w:val="0F766E"/>
+          <w:color w:val="141414"/>
         </w:rPr>
         <w:t>Abstract</w:t>
       </w:r>
@@ -356,7 +356,7 @@
       </w:pPr>
       <w:r>
         <w:rPr>
-          <w:color w:val="0F766E"/>
+          <w:color w:val="141414"/>
         </w:rPr>
         <w:t>1. Introduction</w:t>
       </w:r>
@@ -367,7 +367,7 @@
       </w:pPr>
       <w:r>
         <w:rPr>
-          <w:color w:val="B45309"/>
+          <w:color w:val="3C3C3C"/>
         </w:rPr>
         <w:t>1.1 Topic and Problem</w:t>
       </w:r>
@@ -442,7 +442,7 @@
       </w:pPr>
       <w:r>
         <w:rPr>
-          <w:color w:val="B45309"/>
+          <w:color w:val="3C3C3C"/>
         </w:rPr>
         <w:t>1.2 Objectives</w:t>
       </w:r>
@@ -521,7 +521,7 @@
       </w:pPr>
       <w:r>
         <w:rPr>
-          <w:color w:val="B45309"/>
+          <w:color w:val="3C3C3C"/>
         </w:rPr>
         <w:t>1.3 Why this matters</w:t>
       </w:r>
@@ -566,7 +566,7 @@
       </w:pPr>
       <w:r>
         <w:rPr>
-          <w:color w:val="0F766E"/>
+          <w:color w:val="141414"/>
         </w:rPr>
         <w:t>2. Literature Review</w:t>
       </w:r>
@@ -577,7 +577,7 @@
       </w:pPr>
       <w:r>
         <w:rPr>
-          <w:color w:val="B45309"/>
+          <w:color w:val="3C3C3C"/>
         </w:rPr>
         <w:t>2.1 Classic anti-spoofing defences</w:t>
       </w:r>
@@ -631,7 +631,7 @@
       </w:pPr>
       <w:r>
         <w:rPr>
-          <w:color w:val="B45309"/>
+          <w:color w:val="3C3C3C"/>
         </w:rPr>
         <w:t>2.2 Statistical / machine-learning attribution</w:t>
       </w:r>
@@ -755,7 +755,7 @@
       </w:pPr>
       <w:r>
         <w:rPr>
-          <w:color w:val="B45309"/>
+          <w:color w:val="3C3C3C"/>
         </w:rPr>
         <w:t>2.3 Deep learning</w:t>
       </w:r>
@@ -800,7 +800,7 @@
       </w:pPr>
       <w:r>
         <w:rPr>
-          <w:color w:val="B45309"/>
+          <w:color w:val="3C3C3C"/>
         </w:rPr>
         <w:t>2.4 Where this project sits</w:t>
       </w:r>
@@ -845,7 +845,7 @@
       </w:pPr>
       <w:r>
         <w:rPr>
-          <w:color w:val="0F766E"/>
+          <w:color w:val="141414"/>
         </w:rPr>
         <w:t>3. Methodology</w:t>
       </w:r>
@@ -856,7 +856,7 @@
       </w:pPr>
       <w:r>
         <w:rPr>
-          <w:color w:val="B45309"/>
+          <w:color w:val="3C3C3C"/>
         </w:rPr>
         <w:t>3.1 Tools</w:t>
       </w:r>
@@ -867,12 +867,12 @@
         <w:tblLayout w:type="autofit"/>
         <w:tblLook w:firstColumn="1" w:firstRow="1" w:lastColumn="0" w:lastRow="0" w:noHBand="0" w:noVBand="1" w:val="04A0"/>
         <w:tblBorders>
-          <w:top w:val="single" w:sz="6" w:space="0" w:color="5EEAD4"/>
-          <w:left w:val="single" w:sz="6" w:space="0" w:color="5EEAD4"/>
-          <w:bottom w:val="single" w:sz="6" w:space="0" w:color="5EEAD4"/>
-          <w:right w:val="single" w:sz="6" w:space="0" w:color="5EEAD4"/>
-          <w:insideH w:val="single" w:sz="6" w:space="0" w:color="5EEAD4"/>
-          <w:insideV w:val="single" w:sz="6" w:space="0" w:color="5EEAD4"/>
+          <w:top w:val="single" w:sz="6" w:space="0" w:color="BFBFBF"/>
+          <w:left w:val="single" w:sz="6" w:space="0" w:color="BFBFBF"/>
+          <w:bottom w:val="single" w:sz="6" w:space="0" w:color="BFBFBF"/>
+          <w:right w:val="single" w:sz="6" w:space="0" w:color="BFBFBF"/>
+          <w:insideH w:val="single" w:sz="6" w:space="0" w:color="BFBFBF"/>
+          <w:insideV w:val="single" w:sz="6" w:space="0" w:color="BFBFBF"/>
         </w:tblBorders>
       </w:tblPr>
       <w:tblGrid>
@@ -885,7 +885,7 @@
           <w:tcPr>
             <w:tcW w:type="dxa" w:w="3216"/>
             <w:vAlign w:val="center"/>
-            <w:shd w:val="clear" w:color="auto" w:fill="0F766E"/>
+            <w:shd w:val="clear" w:color="auto" w:fill="1A1A1A"/>
             <w:tcMar>
               <w:top w:w="80" w:type="dxa"/>
               <w:bottom w:w="80" w:type="dxa"/>
@@ -918,7 +918,7 @@
           <w:tcPr>
             <w:tcW w:type="dxa" w:w="3216"/>
             <w:vAlign w:val="center"/>
-            <w:shd w:val="clear" w:color="auto" w:fill="0F766E"/>
+            <w:shd w:val="clear" w:color="auto" w:fill="1A1A1A"/>
             <w:tcMar>
               <w:top w:w="80" w:type="dxa"/>
               <w:bottom w:w="80" w:type="dxa"/>
@@ -951,7 +951,7 @@
           <w:tcPr>
             <w:tcW w:type="dxa" w:w="3216"/>
             <w:vAlign w:val="center"/>
-            <w:shd w:val="clear" w:color="auto" w:fill="0F766E"/>
+            <w:shd w:val="clear" w:color="auto" w:fill="1A1A1A"/>
             <w:tcMar>
               <w:top w:w="80" w:type="dxa"/>
               <w:bottom w:w="80" w:type="dxa"/>
@@ -1072,7 +1072,7 @@
           <w:tcPr>
             <w:tcW w:type="dxa" w:w="3216"/>
             <w:vAlign w:val="center"/>
-            <w:shd w:val="clear" w:color="auto" w:fill="ECFEFF"/>
+            <w:shd w:val="clear" w:color="auto" w:fill="F2F2F2"/>
             <w:tcMar>
               <w:top w:w="80" w:type="dxa"/>
               <w:bottom w:w="80" w:type="dxa"/>
@@ -1101,7 +1101,7 @@
           <w:tcPr>
             <w:tcW w:type="dxa" w:w="3216"/>
             <w:vAlign w:val="center"/>
-            <w:shd w:val="clear" w:color="auto" w:fill="ECFEFF"/>
+            <w:shd w:val="clear" w:color="auto" w:fill="F2F2F2"/>
             <w:tcMar>
               <w:top w:w="80" w:type="dxa"/>
               <w:bottom w:w="80" w:type="dxa"/>
@@ -1130,7 +1130,7 @@
           <w:tcPr>
             <w:tcW w:type="dxa" w:w="3216"/>
             <w:vAlign w:val="center"/>
-            <w:shd w:val="clear" w:color="auto" w:fill="ECFEFF"/>
+            <w:shd w:val="clear" w:color="auto" w:fill="F2F2F2"/>
             <w:tcMar>
               <w:top w:w="80" w:type="dxa"/>
               <w:bottom w:w="80" w:type="dxa"/>
@@ -1280,7 +1280,7 @@
           <w:tcPr>
             <w:tcW w:type="dxa" w:w="3216"/>
             <w:vAlign w:val="center"/>
-            <w:shd w:val="clear" w:color="auto" w:fill="ECFEFF"/>
+            <w:shd w:val="clear" w:color="auto" w:fill="F2F2F2"/>
             <w:tcMar>
               <w:top w:w="80" w:type="dxa"/>
               <w:bottom w:w="80" w:type="dxa"/>
@@ -1309,7 +1309,7 @@
           <w:tcPr>
             <w:tcW w:type="dxa" w:w="3216"/>
             <w:vAlign w:val="center"/>
-            <w:shd w:val="clear" w:color="auto" w:fill="ECFEFF"/>
+            <w:shd w:val="clear" w:color="auto" w:fill="F2F2F2"/>
             <w:tcMar>
               <w:top w:w="80" w:type="dxa"/>
               <w:bottom w:w="80" w:type="dxa"/>
@@ -1338,7 +1338,7 @@
           <w:tcPr>
             <w:tcW w:type="dxa" w:w="3216"/>
             <w:vAlign w:val="center"/>
-            <w:shd w:val="clear" w:color="auto" w:fill="ECFEFF"/>
+            <w:shd w:val="clear" w:color="auto" w:fill="F2F2F2"/>
             <w:tcMar>
               <w:top w:w="80" w:type="dxa"/>
               <w:bottom w:w="80" w:type="dxa"/>
@@ -1456,7 +1456,7 @@
           <w:tcPr>
             <w:tcW w:type="dxa" w:w="3216"/>
             <w:vAlign w:val="center"/>
-            <w:shd w:val="clear" w:color="auto" w:fill="ECFEFF"/>
+            <w:shd w:val="clear" w:color="auto" w:fill="F2F2F2"/>
             <w:tcMar>
               <w:top w:w="80" w:type="dxa"/>
               <w:bottom w:w="80" w:type="dxa"/>
@@ -1485,7 +1485,7 @@
           <w:tcPr>
             <w:tcW w:type="dxa" w:w="3216"/>
             <w:vAlign w:val="center"/>
-            <w:shd w:val="clear" w:color="auto" w:fill="ECFEFF"/>
+            <w:shd w:val="clear" w:color="auto" w:fill="F2F2F2"/>
             <w:tcMar>
               <w:top w:w="80" w:type="dxa"/>
               <w:bottom w:w="80" w:type="dxa"/>
@@ -1514,7 +1514,7 @@
           <w:tcPr>
             <w:tcW w:type="dxa" w:w="3216"/>
             <w:vAlign w:val="center"/>
-            <w:shd w:val="clear" w:color="auto" w:fill="ECFEFF"/>
+            <w:shd w:val="clear" w:color="auto" w:fill="F2F2F2"/>
             <w:tcMar>
               <w:top w:w="80" w:type="dxa"/>
               <w:bottom w:w="80" w:type="dxa"/>
@@ -1555,7 +1555,7 @@
       </w:pPr>
       <w:r>
         <w:rPr>
-          <w:color w:val="B45309"/>
+          <w:color w:val="3C3C3C"/>
         </w:rPr>
         <w:t>3.2 Data</w:t>
       </w:r>
@@ -1634,7 +1634,7 @@
       </w:pPr>
       <w:r>
         <w:rPr>
-          <w:color w:val="B45309"/>
+          <w:color w:val="3C3C3C"/>
         </w:rPr>
         <w:t>3.3 Features</w:t>
       </w:r>
@@ -1662,12 +1662,12 @@
         <w:tblLayout w:type="autofit"/>
         <w:tblLook w:firstColumn="1" w:firstRow="1" w:lastColumn="0" w:lastRow="0" w:noHBand="0" w:noVBand="1" w:val="04A0"/>
         <w:tblBorders>
-          <w:top w:val="single" w:sz="6" w:space="0" w:color="5EEAD4"/>
-          <w:left w:val="single" w:sz="6" w:space="0" w:color="5EEAD4"/>
-          <w:bottom w:val="single" w:sz="6" w:space="0" w:color="5EEAD4"/>
-          <w:right w:val="single" w:sz="6" w:space="0" w:color="5EEAD4"/>
-          <w:insideH w:val="single" w:sz="6" w:space="0" w:color="5EEAD4"/>
-          <w:insideV w:val="single" w:sz="6" w:space="0" w:color="5EEAD4"/>
+          <w:top w:val="single" w:sz="6" w:space="0" w:color="BFBFBF"/>
+          <w:left w:val="single" w:sz="6" w:space="0" w:color="BFBFBF"/>
+          <w:bottom w:val="single" w:sz="6" w:space="0" w:color="BFBFBF"/>
+          <w:right w:val="single" w:sz="6" w:space="0" w:color="BFBFBF"/>
+          <w:insideH w:val="single" w:sz="6" w:space="0" w:color="BFBFBF"/>
+          <w:insideV w:val="single" w:sz="6" w:space="0" w:color="BFBFBF"/>
         </w:tblBorders>
       </w:tblPr>
       <w:tblGrid>
@@ -1679,7 +1679,7 @@
           <w:tcPr>
             <w:tcW w:type="dxa" w:w="4824"/>
             <w:vAlign w:val="center"/>
-            <w:shd w:val="clear" w:color="auto" w:fill="0F766E"/>
+            <w:shd w:val="clear" w:color="auto" w:fill="1A1A1A"/>
             <w:tcMar>
               <w:top w:w="80" w:type="dxa"/>
               <w:bottom w:w="80" w:type="dxa"/>
@@ -1712,7 +1712,7 @@
           <w:tcPr>
             <w:tcW w:type="dxa" w:w="4824"/>
             <w:vAlign w:val="center"/>
-            <w:shd w:val="clear" w:color="auto" w:fill="0F766E"/>
+            <w:shd w:val="clear" w:color="auto" w:fill="1A1A1A"/>
             <w:tcMar>
               <w:top w:w="80" w:type="dxa"/>
               <w:bottom w:w="80" w:type="dxa"/>
@@ -1806,7 +1806,7 @@
           <w:tcPr>
             <w:tcW w:type="dxa" w:w="4824"/>
             <w:vAlign w:val="center"/>
-            <w:shd w:val="clear" w:color="auto" w:fill="ECFEFF"/>
+            <w:shd w:val="clear" w:color="auto" w:fill="F2F2F2"/>
             <w:tcMar>
               <w:top w:w="80" w:type="dxa"/>
               <w:bottom w:w="80" w:type="dxa"/>
@@ -1836,7 +1836,7 @@
           <w:tcPr>
             <w:tcW w:type="dxa" w:w="4824"/>
             <w:vAlign w:val="center"/>
-            <w:shd w:val="clear" w:color="auto" w:fill="ECFEFF"/>
+            <w:shd w:val="clear" w:color="auto" w:fill="F2F2F2"/>
             <w:tcMar>
               <w:top w:w="80" w:type="dxa"/>
               <w:bottom w:w="80" w:type="dxa"/>
@@ -1926,7 +1926,7 @@
           <w:tcPr>
             <w:tcW w:type="dxa" w:w="4824"/>
             <w:vAlign w:val="center"/>
-            <w:shd w:val="clear" w:color="auto" w:fill="ECFEFF"/>
+            <w:shd w:val="clear" w:color="auto" w:fill="F2F2F2"/>
             <w:tcMar>
               <w:top w:w="80" w:type="dxa"/>
               <w:bottom w:w="80" w:type="dxa"/>
@@ -1956,7 +1956,7 @@
           <w:tcPr>
             <w:tcW w:type="dxa" w:w="4824"/>
             <w:vAlign w:val="center"/>
-            <w:shd w:val="clear" w:color="auto" w:fill="ECFEFF"/>
+            <w:shd w:val="clear" w:color="auto" w:fill="F2F2F2"/>
             <w:tcMar>
               <w:top w:w="80" w:type="dxa"/>
               <w:bottom w:w="80" w:type="dxa"/>
@@ -2046,7 +2046,7 @@
           <w:tcPr>
             <w:tcW w:type="dxa" w:w="4824"/>
             <w:vAlign w:val="center"/>
-            <w:shd w:val="clear" w:color="auto" w:fill="ECFEFF"/>
+            <w:shd w:val="clear" w:color="auto" w:fill="F2F2F2"/>
             <w:tcMar>
               <w:top w:w="80" w:type="dxa"/>
               <w:bottom w:w="80" w:type="dxa"/>
@@ -2076,7 +2076,7 @@
           <w:tcPr>
             <w:tcW w:type="dxa" w:w="4824"/>
             <w:vAlign w:val="center"/>
-            <w:shd w:val="clear" w:color="auto" w:fill="ECFEFF"/>
+            <w:shd w:val="clear" w:color="auto" w:fill="F2F2F2"/>
             <w:tcMar>
               <w:top w:w="80" w:type="dxa"/>
               <w:bottom w:w="80" w:type="dxa"/>
@@ -2166,7 +2166,7 @@
           <w:tcPr>
             <w:tcW w:type="dxa" w:w="4824"/>
             <w:vAlign w:val="center"/>
-            <w:shd w:val="clear" w:color="auto" w:fill="ECFEFF"/>
+            <w:shd w:val="clear" w:color="auto" w:fill="F2F2F2"/>
             <w:tcMar>
               <w:top w:w="80" w:type="dxa"/>
               <w:bottom w:w="80" w:type="dxa"/>
@@ -2196,7 +2196,7 @@
           <w:tcPr>
             <w:tcW w:type="dxa" w:w="4824"/>
             <w:vAlign w:val="center"/>
-            <w:shd w:val="clear" w:color="auto" w:fill="ECFEFF"/>
+            <w:shd w:val="clear" w:color="auto" w:fill="F2F2F2"/>
             <w:tcMar>
               <w:top w:w="80" w:type="dxa"/>
               <w:bottom w:w="80" w:type="dxa"/>
@@ -2286,7 +2286,7 @@
           <w:tcPr>
             <w:tcW w:type="dxa" w:w="4824"/>
             <w:vAlign w:val="center"/>
-            <w:shd w:val="clear" w:color="auto" w:fill="ECFEFF"/>
+            <w:shd w:val="clear" w:color="auto" w:fill="F2F2F2"/>
             <w:tcMar>
               <w:top w:w="80" w:type="dxa"/>
               <w:bottom w:w="80" w:type="dxa"/>
@@ -2316,7 +2316,7 @@
           <w:tcPr>
             <w:tcW w:type="dxa" w:w="4824"/>
             <w:vAlign w:val="center"/>
-            <w:shd w:val="clear" w:color="auto" w:fill="ECFEFF"/>
+            <w:shd w:val="clear" w:color="auto" w:fill="F2F2F2"/>
             <w:tcMar>
               <w:top w:w="80" w:type="dxa"/>
               <w:bottom w:w="80" w:type="dxa"/>
@@ -2406,7 +2406,7 @@
           <w:tcPr>
             <w:tcW w:type="dxa" w:w="4824"/>
             <w:vAlign w:val="center"/>
-            <w:shd w:val="clear" w:color="auto" w:fill="ECFEFF"/>
+            <w:shd w:val="clear" w:color="auto" w:fill="F2F2F2"/>
             <w:tcMar>
               <w:top w:w="80" w:type="dxa"/>
               <w:bottom w:w="80" w:type="dxa"/>
@@ -2436,7 +2436,7 @@
           <w:tcPr>
             <w:tcW w:type="dxa" w:w="4824"/>
             <w:vAlign w:val="center"/>
-            <w:shd w:val="clear" w:color="auto" w:fill="ECFEFF"/>
+            <w:shd w:val="clear" w:color="auto" w:fill="F2F2F2"/>
             <w:tcMar>
               <w:top w:w="80" w:type="dxa"/>
               <w:bottom w:w="80" w:type="dxa"/>
@@ -2526,7 +2526,7 @@
           <w:tcPr>
             <w:tcW w:type="dxa" w:w="4824"/>
             <w:vAlign w:val="center"/>
-            <w:shd w:val="clear" w:color="auto" w:fill="ECFEFF"/>
+            <w:shd w:val="clear" w:color="auto" w:fill="F2F2F2"/>
             <w:tcMar>
               <w:top w:w="80" w:type="dxa"/>
               <w:bottom w:w="80" w:type="dxa"/>
@@ -2556,7 +2556,7 @@
           <w:tcPr>
             <w:tcW w:type="dxa" w:w="4824"/>
             <w:vAlign w:val="center"/>
-            <w:shd w:val="clear" w:color="auto" w:fill="ECFEFF"/>
+            <w:shd w:val="clear" w:color="auto" w:fill="F2F2F2"/>
             <w:tcMar>
               <w:top w:w="80" w:type="dxa"/>
               <w:bottom w:w="80" w:type="dxa"/>
@@ -2590,7 +2590,7 @@
       </w:pPr>
       <w:r>
         <w:rPr>
-          <w:color w:val="B45309"/>
+          <w:color w:val="3C3C3C"/>
         </w:rPr>
         <w:t>3.4 Models</w:t>
       </w:r>
@@ -2804,7 +2804,7 @@
       </w:pPr>
       <w:r>
         <w:rPr>
-          <w:color w:val="B45309"/>
+          <w:color w:val="3C3C3C"/>
         </w:rPr>
         <w:t>3.5 Experimental protocol</w:t>
       </w:r>
@@ -2941,7 +2941,7 @@
       </w:pPr>
       <w:r>
         <w:rPr>
-          <w:color w:val="0F766E"/>
+          <w:color w:val="141414"/>
         </w:rPr>
         <w:t>4. Results</w:t>
       </w:r>
@@ -2952,7 +2952,7 @@
       </w:pPr>
       <w:r>
         <w:rPr>
-          <w:color w:val="B45309"/>
+          <w:color w:val="3C3C3C"/>
         </w:rPr>
         <w:t>4.1 Held-out test-set metrics (2 000 flows: 1 000 real / 1 000 spoof/decoy)</w:t>
       </w:r>
@@ -2963,12 +2963,12 @@
         <w:tblLayout w:type="autofit"/>
         <w:tblLook w:firstColumn="1" w:firstRow="1" w:lastColumn="0" w:lastRow="0" w:noHBand="0" w:noVBand="1" w:val="04A0"/>
         <w:tblBorders>
-          <w:top w:val="single" w:sz="6" w:space="0" w:color="5EEAD4"/>
-          <w:left w:val="single" w:sz="6" w:space="0" w:color="5EEAD4"/>
-          <w:bottom w:val="single" w:sz="6" w:space="0" w:color="5EEAD4"/>
-          <w:right w:val="single" w:sz="6" w:space="0" w:color="5EEAD4"/>
-          <w:insideH w:val="single" w:sz="6" w:space="0" w:color="5EEAD4"/>
-          <w:insideV w:val="single" w:sz="6" w:space="0" w:color="5EEAD4"/>
+          <w:top w:val="single" w:sz="6" w:space="0" w:color="BFBFBF"/>
+          <w:left w:val="single" w:sz="6" w:space="0" w:color="BFBFBF"/>
+          <w:bottom w:val="single" w:sz="6" w:space="0" w:color="BFBFBF"/>
+          <w:right w:val="single" w:sz="6" w:space="0" w:color="BFBFBF"/>
+          <w:insideH w:val="single" w:sz="6" w:space="0" w:color="BFBFBF"/>
+          <w:insideV w:val="single" w:sz="6" w:space="0" w:color="BFBFBF"/>
         </w:tblBorders>
       </w:tblPr>
       <w:tblGrid>
@@ -2984,7 +2984,7 @@
           <w:tcPr>
             <w:tcW w:type="dxa" w:w="1608"/>
             <w:vAlign w:val="center"/>
-            <w:shd w:val="clear" w:color="auto" w:fill="0F766E"/>
+            <w:shd w:val="clear" w:color="auto" w:fill="1A1A1A"/>
             <w:tcMar>
               <w:top w:w="80" w:type="dxa"/>
               <w:bottom w:w="80" w:type="dxa"/>
@@ -3017,7 +3017,7 @@
           <w:tcPr>
             <w:tcW w:type="dxa" w:w="1608"/>
             <w:vAlign w:val="center"/>
-            <w:shd w:val="clear" w:color="auto" w:fill="0F766E"/>
+            <w:shd w:val="clear" w:color="auto" w:fill="1A1A1A"/>
             <w:tcMar>
               <w:top w:w="80" w:type="dxa"/>
               <w:bottom w:w="80" w:type="dxa"/>
@@ -3050,7 +3050,7 @@
           <w:tcPr>
             <w:tcW w:type="dxa" w:w="1608"/>
             <w:vAlign w:val="center"/>
-            <w:shd w:val="clear" w:color="auto" w:fill="0F766E"/>
+            <w:shd w:val="clear" w:color="auto" w:fill="1A1A1A"/>
             <w:tcMar>
               <w:top w:w="80" w:type="dxa"/>
               <w:bottom w:w="80" w:type="dxa"/>
@@ -3083,7 +3083,7 @@
           <w:tcPr>
             <w:tcW w:type="dxa" w:w="1608"/>
             <w:vAlign w:val="center"/>
-            <w:shd w:val="clear" w:color="auto" w:fill="0F766E"/>
+            <w:shd w:val="clear" w:color="auto" w:fill="1A1A1A"/>
             <w:tcMar>
               <w:top w:w="80" w:type="dxa"/>
               <w:bottom w:w="80" w:type="dxa"/>
@@ -3116,7 +3116,7 @@
           <w:tcPr>
             <w:tcW w:type="dxa" w:w="1608"/>
             <w:vAlign w:val="center"/>
-            <w:shd w:val="clear" w:color="auto" w:fill="0F766E"/>
+            <w:shd w:val="clear" w:color="auto" w:fill="1A1A1A"/>
             <w:tcMar>
               <w:top w:w="80" w:type="dxa"/>
               <w:bottom w:w="80" w:type="dxa"/>
@@ -3149,7 +3149,7 @@
           <w:tcPr>
             <w:tcW w:type="dxa" w:w="1608"/>
             <w:vAlign w:val="center"/>
-            <w:shd w:val="clear" w:color="auto" w:fill="0F766E"/>
+            <w:shd w:val="clear" w:color="auto" w:fill="1A1A1A"/>
             <w:tcMar>
               <w:top w:w="80" w:type="dxa"/>
               <w:bottom w:w="80" w:type="dxa"/>
@@ -3354,7 +3354,7 @@
           <w:tcPr>
             <w:tcW w:type="dxa" w:w="1608"/>
             <w:vAlign w:val="center"/>
-            <w:shd w:val="clear" w:color="auto" w:fill="ECFEFF"/>
+            <w:shd w:val="clear" w:color="auto" w:fill="F2F2F2"/>
             <w:tcMar>
               <w:top w:w="80" w:type="dxa"/>
               <w:bottom w:w="80" w:type="dxa"/>
@@ -3383,7 +3383,7 @@
           <w:tcPr>
             <w:tcW w:type="dxa" w:w="1608"/>
             <w:vAlign w:val="center"/>
-            <w:shd w:val="clear" w:color="auto" w:fill="ECFEFF"/>
+            <w:shd w:val="clear" w:color="auto" w:fill="F2F2F2"/>
             <w:tcMar>
               <w:top w:w="80" w:type="dxa"/>
               <w:bottom w:w="80" w:type="dxa"/>
@@ -3412,7 +3412,7 @@
           <w:tcPr>
             <w:tcW w:type="dxa" w:w="1608"/>
             <w:vAlign w:val="center"/>
-            <w:shd w:val="clear" w:color="auto" w:fill="ECFEFF"/>
+            <w:shd w:val="clear" w:color="auto" w:fill="F2F2F2"/>
             <w:tcMar>
               <w:top w:w="80" w:type="dxa"/>
               <w:bottom w:w="80" w:type="dxa"/>
@@ -3441,7 +3441,7 @@
           <w:tcPr>
             <w:tcW w:type="dxa" w:w="1608"/>
             <w:vAlign w:val="center"/>
-            <w:shd w:val="clear" w:color="auto" w:fill="ECFEFF"/>
+            <w:shd w:val="clear" w:color="auto" w:fill="F2F2F2"/>
             <w:tcMar>
               <w:top w:w="80" w:type="dxa"/>
               <w:bottom w:w="80" w:type="dxa"/>
@@ -3470,7 +3470,7 @@
           <w:tcPr>
             <w:tcW w:type="dxa" w:w="1608"/>
             <w:vAlign w:val="center"/>
-            <w:shd w:val="clear" w:color="auto" w:fill="ECFEFF"/>
+            <w:shd w:val="clear" w:color="auto" w:fill="F2F2F2"/>
             <w:tcMar>
               <w:top w:w="80" w:type="dxa"/>
               <w:bottom w:w="80" w:type="dxa"/>
@@ -3499,7 +3499,7 @@
           <w:tcPr>
             <w:tcW w:type="dxa" w:w="1608"/>
             <w:vAlign w:val="center"/>
-            <w:shd w:val="clear" w:color="auto" w:fill="ECFEFF"/>
+            <w:shd w:val="clear" w:color="auto" w:fill="F2F2F2"/>
             <w:tcMar>
               <w:top w:w="80" w:type="dxa"/>
               <w:bottom w:w="80" w:type="dxa"/>
@@ -3711,7 +3711,7 @@
       </w:pPr>
       <w:r>
         <w:rPr>
-          <w:color w:val="B45309"/>
+          <w:color w:val="3C3C3C"/>
         </w:rPr>
         <w:t>4.2 5-fold cross-validation on the training split (8 000 flows)</w:t>
       </w:r>
@@ -3722,12 +3722,12 @@
         <w:tblLayout w:type="autofit"/>
         <w:tblLook w:firstColumn="1" w:firstRow="1" w:lastColumn="0" w:lastRow="0" w:noHBand="0" w:noVBand="1" w:val="04A0"/>
         <w:tblBorders>
-          <w:top w:val="single" w:sz="6" w:space="0" w:color="5EEAD4"/>
-          <w:left w:val="single" w:sz="6" w:space="0" w:color="5EEAD4"/>
-          <w:bottom w:val="single" w:sz="6" w:space="0" w:color="5EEAD4"/>
-          <w:right w:val="single" w:sz="6" w:space="0" w:color="5EEAD4"/>
-          <w:insideH w:val="single" w:sz="6" w:space="0" w:color="5EEAD4"/>
-          <w:insideV w:val="single" w:sz="6" w:space="0" w:color="5EEAD4"/>
+          <w:top w:val="single" w:sz="6" w:space="0" w:color="BFBFBF"/>
+          <w:left w:val="single" w:sz="6" w:space="0" w:color="BFBFBF"/>
+          <w:bottom w:val="single" w:sz="6" w:space="0" w:color="BFBFBF"/>
+          <w:right w:val="single" w:sz="6" w:space="0" w:color="BFBFBF"/>
+          <w:insideH w:val="single" w:sz="6" w:space="0" w:color="BFBFBF"/>
+          <w:insideV w:val="single" w:sz="6" w:space="0" w:color="BFBFBF"/>
         </w:tblBorders>
       </w:tblPr>
       <w:tblGrid>
@@ -3741,7 +3741,7 @@
           <w:tcPr>
             <w:tcW w:type="dxa" w:w="2412"/>
             <w:vAlign w:val="center"/>
-            <w:shd w:val="clear" w:color="auto" w:fill="0F766E"/>
+            <w:shd w:val="clear" w:color="auto" w:fill="1A1A1A"/>
             <w:tcMar>
               <w:top w:w="80" w:type="dxa"/>
               <w:bottom w:w="80" w:type="dxa"/>
@@ -3774,7 +3774,7 @@
           <w:tcPr>
             <w:tcW w:type="dxa" w:w="2412"/>
             <w:vAlign w:val="center"/>
-            <w:shd w:val="clear" w:color="auto" w:fill="0F766E"/>
+            <w:shd w:val="clear" w:color="auto" w:fill="1A1A1A"/>
             <w:tcMar>
               <w:top w:w="80" w:type="dxa"/>
               <w:bottom w:w="80" w:type="dxa"/>
@@ -3807,7 +3807,7 @@
           <w:tcPr>
             <w:tcW w:type="dxa" w:w="2412"/>
             <w:vAlign w:val="center"/>
-            <w:shd w:val="clear" w:color="auto" w:fill="0F766E"/>
+            <w:shd w:val="clear" w:color="auto" w:fill="1A1A1A"/>
             <w:tcMar>
               <w:top w:w="80" w:type="dxa"/>
               <w:bottom w:w="80" w:type="dxa"/>
@@ -3840,7 +3840,7 @@
           <w:tcPr>
             <w:tcW w:type="dxa" w:w="2412"/>
             <w:vAlign w:val="center"/>
-            <w:shd w:val="clear" w:color="auto" w:fill="0F766E"/>
+            <w:shd w:val="clear" w:color="auto" w:fill="1A1A1A"/>
             <w:tcMar>
               <w:top w:w="80" w:type="dxa"/>
               <w:bottom w:w="80" w:type="dxa"/>
@@ -3989,7 +3989,7 @@
           <w:tcPr>
             <w:tcW w:type="dxa" w:w="2412"/>
             <w:vAlign w:val="center"/>
-            <w:shd w:val="clear" w:color="auto" w:fill="ECFEFF"/>
+            <w:shd w:val="clear" w:color="auto" w:fill="F2F2F2"/>
             <w:tcMar>
               <w:top w:w="80" w:type="dxa"/>
               <w:bottom w:w="80" w:type="dxa"/>
@@ -4018,7 +4018,7 @@
           <w:tcPr>
             <w:tcW w:type="dxa" w:w="2412"/>
             <w:vAlign w:val="center"/>
-            <w:shd w:val="clear" w:color="auto" w:fill="ECFEFF"/>
+            <w:shd w:val="clear" w:color="auto" w:fill="F2F2F2"/>
             <w:tcMar>
               <w:top w:w="80" w:type="dxa"/>
               <w:bottom w:w="80" w:type="dxa"/>
@@ -4047,7 +4047,7 @@
           <w:tcPr>
             <w:tcW w:type="dxa" w:w="2412"/>
             <w:vAlign w:val="center"/>
-            <w:shd w:val="clear" w:color="auto" w:fill="ECFEFF"/>
+            <w:shd w:val="clear" w:color="auto" w:fill="F2F2F2"/>
             <w:tcMar>
               <w:top w:w="80" w:type="dxa"/>
               <w:bottom w:w="80" w:type="dxa"/>
@@ -4076,7 +4076,7 @@
           <w:tcPr>
             <w:tcW w:type="dxa" w:w="2412"/>
             <w:vAlign w:val="center"/>
-            <w:shd w:val="clear" w:color="auto" w:fill="ECFEFF"/>
+            <w:shd w:val="clear" w:color="auto" w:fill="F2F2F2"/>
             <w:tcMar>
               <w:top w:w="80" w:type="dxa"/>
               <w:bottom w:w="80" w:type="dxa"/>
@@ -4110,7 +4110,7 @@
       </w:pPr>
       <w:r>
         <w:rPr>
-          <w:color w:val="B45309"/>
+          <w:color w:val="3C3C3C"/>
         </w:rPr>
         <w:t>4.3 Confusion matrices</w:t>
       </w:r>
@@ -4121,12 +4121,12 @@
         <w:tblLayout w:type="autofit"/>
         <w:tblLook w:firstColumn="1" w:firstRow="1" w:lastColumn="0" w:lastRow="0" w:noHBand="0" w:noVBand="1" w:val="04A0"/>
         <w:tblBorders>
-          <w:top w:val="single" w:sz="6" w:space="0" w:color="5EEAD4"/>
-          <w:left w:val="single" w:sz="6" w:space="0" w:color="5EEAD4"/>
-          <w:bottom w:val="single" w:sz="6" w:space="0" w:color="5EEAD4"/>
-          <w:right w:val="single" w:sz="6" w:space="0" w:color="5EEAD4"/>
-          <w:insideH w:val="single" w:sz="6" w:space="0" w:color="5EEAD4"/>
-          <w:insideV w:val="single" w:sz="6" w:space="0" w:color="5EEAD4"/>
+          <w:top w:val="single" w:sz="6" w:space="0" w:color="BFBFBF"/>
+          <w:left w:val="single" w:sz="6" w:space="0" w:color="BFBFBF"/>
+          <w:bottom w:val="single" w:sz="6" w:space="0" w:color="BFBFBF"/>
+          <w:right w:val="single" w:sz="6" w:space="0" w:color="BFBFBF"/>
+          <w:insideH w:val="single" w:sz="6" w:space="0" w:color="BFBFBF"/>
+          <w:insideV w:val="single" w:sz="6" w:space="0" w:color="BFBFBF"/>
         </w:tblBorders>
       </w:tblPr>
       <w:tblGrid>
@@ -4141,7 +4141,7 @@
           <w:tcPr>
             <w:tcW w:type="dxa" w:w="1930"/>
             <w:vAlign w:val="center"/>
-            <w:shd w:val="clear" w:color="auto" w:fill="0F766E"/>
+            <w:shd w:val="clear" w:color="auto" w:fill="1A1A1A"/>
             <w:tcMar>
               <w:top w:w="80" w:type="dxa"/>
               <w:bottom w:w="80" w:type="dxa"/>
@@ -4174,7 +4174,7 @@
           <w:tcPr>
             <w:tcW w:type="dxa" w:w="1930"/>
             <w:vAlign w:val="center"/>
-            <w:shd w:val="clear" w:color="auto" w:fill="0F766E"/>
+            <w:shd w:val="clear" w:color="auto" w:fill="1A1A1A"/>
             <w:tcMar>
               <w:top w:w="80" w:type="dxa"/>
               <w:bottom w:w="80" w:type="dxa"/>
@@ -4207,7 +4207,7 @@
           <w:tcPr>
             <w:tcW w:type="dxa" w:w="1930"/>
             <w:vAlign w:val="center"/>
-            <w:shd w:val="clear" w:color="auto" w:fill="0F766E"/>
+            <w:shd w:val="clear" w:color="auto" w:fill="1A1A1A"/>
             <w:tcMar>
               <w:top w:w="80" w:type="dxa"/>
               <w:bottom w:w="80" w:type="dxa"/>
@@ -4240,7 +4240,7 @@
           <w:tcPr>
             <w:tcW w:type="dxa" w:w="1930"/>
             <w:vAlign w:val="center"/>
-            <w:shd w:val="clear" w:color="auto" w:fill="0F766E"/>
+            <w:shd w:val="clear" w:color="auto" w:fill="1A1A1A"/>
             <w:tcMar>
               <w:top w:w="80" w:type="dxa"/>
               <w:bottom w:w="80" w:type="dxa"/>
@@ -4273,7 +4273,7 @@
           <w:tcPr>
             <w:tcW w:type="dxa" w:w="1930"/>
             <w:vAlign w:val="center"/>
-            <w:shd w:val="clear" w:color="auto" w:fill="0F766E"/>
+            <w:shd w:val="clear" w:color="auto" w:fill="1A1A1A"/>
             <w:tcMar>
               <w:top w:w="80" w:type="dxa"/>
               <w:bottom w:w="80" w:type="dxa"/>
@@ -4450,7 +4450,7 @@
           <w:tcPr>
             <w:tcW w:type="dxa" w:w="1930"/>
             <w:vAlign w:val="center"/>
-            <w:shd w:val="clear" w:color="auto" w:fill="ECFEFF"/>
+            <w:shd w:val="clear" w:color="auto" w:fill="F2F2F2"/>
             <w:tcMar>
               <w:top w:w="80" w:type="dxa"/>
               <w:bottom w:w="80" w:type="dxa"/>
@@ -4479,7 +4479,7 @@
           <w:tcPr>
             <w:tcW w:type="dxa" w:w="1930"/>
             <w:vAlign w:val="center"/>
-            <w:shd w:val="clear" w:color="auto" w:fill="ECFEFF"/>
+            <w:shd w:val="clear" w:color="auto" w:fill="F2F2F2"/>
             <w:tcMar>
               <w:top w:w="80" w:type="dxa"/>
               <w:bottom w:w="80" w:type="dxa"/>
@@ -4508,7 +4508,7 @@
           <w:tcPr>
             <w:tcW w:type="dxa" w:w="1930"/>
             <w:vAlign w:val="center"/>
-            <w:shd w:val="clear" w:color="auto" w:fill="ECFEFF"/>
+            <w:shd w:val="clear" w:color="auto" w:fill="F2F2F2"/>
             <w:tcMar>
               <w:top w:w="80" w:type="dxa"/>
               <w:bottom w:w="80" w:type="dxa"/>
@@ -4537,7 +4537,7 @@
           <w:tcPr>
             <w:tcW w:type="dxa" w:w="1930"/>
             <w:vAlign w:val="center"/>
-            <w:shd w:val="clear" w:color="auto" w:fill="ECFEFF"/>
+            <w:shd w:val="clear" w:color="auto" w:fill="F2F2F2"/>
             <w:tcMar>
               <w:top w:w="80" w:type="dxa"/>
               <w:bottom w:w="80" w:type="dxa"/>
@@ -4566,7 +4566,7 @@
           <w:tcPr>
             <w:tcW w:type="dxa" w:w="1930"/>
             <w:vAlign w:val="center"/>
-            <w:shd w:val="clear" w:color="auto" w:fill="ECFEFF"/>
+            <w:shd w:val="clear" w:color="auto" w:fill="F2F2F2"/>
             <w:tcMar>
               <w:top w:w="80" w:type="dxa"/>
               <w:bottom w:w="80" w:type="dxa"/>
@@ -4742,7 +4742,7 @@
       </w:pPr>
       <w:r>
         <w:rPr>
-          <w:color w:val="B45309"/>
+          <w:color w:val="3C3C3C"/>
         </w:rPr>
         <w:t>4.4 Top features (Random Forest Gini importance)</w:t>
       </w:r>
@@ -4753,12 +4753,12 @@
         <w:tblLayout w:type="autofit"/>
         <w:tblLook w:firstColumn="1" w:firstRow="1" w:lastColumn="0" w:lastRow="0" w:noHBand="0" w:noVBand="1" w:val="04A0"/>
         <w:tblBorders>
-          <w:top w:val="single" w:sz="6" w:space="0" w:color="5EEAD4"/>
-          <w:left w:val="single" w:sz="6" w:space="0" w:color="5EEAD4"/>
-          <w:bottom w:val="single" w:sz="6" w:space="0" w:color="5EEAD4"/>
-          <w:right w:val="single" w:sz="6" w:space="0" w:color="5EEAD4"/>
-          <w:insideH w:val="single" w:sz="6" w:space="0" w:color="5EEAD4"/>
-          <w:insideV w:val="single" w:sz="6" w:space="0" w:color="5EEAD4"/>
+          <w:top w:val="single" w:sz="6" w:space="0" w:color="BFBFBF"/>
+          <w:left w:val="single" w:sz="6" w:space="0" w:color="BFBFBF"/>
+          <w:bottom w:val="single" w:sz="6" w:space="0" w:color="BFBFBF"/>
+          <w:right w:val="single" w:sz="6" w:space="0" w:color="BFBFBF"/>
+          <w:insideH w:val="single" w:sz="6" w:space="0" w:color="BFBFBF"/>
+          <w:insideV w:val="single" w:sz="6" w:space="0" w:color="BFBFBF"/>
         </w:tblBorders>
       </w:tblPr>
       <w:tblGrid>
@@ -4771,7 +4771,7 @@
           <w:tcPr>
             <w:tcW w:type="dxa" w:w="3216"/>
             <w:vAlign w:val="center"/>
-            <w:shd w:val="clear" w:color="auto" w:fill="0F766E"/>
+            <w:shd w:val="clear" w:color="auto" w:fill="1A1A1A"/>
             <w:tcMar>
               <w:top w:w="80" w:type="dxa"/>
               <w:bottom w:w="80" w:type="dxa"/>
@@ -4804,7 +4804,7 @@
           <w:tcPr>
             <w:tcW w:type="dxa" w:w="3216"/>
             <w:vAlign w:val="center"/>
-            <w:shd w:val="clear" w:color="auto" w:fill="0F766E"/>
+            <w:shd w:val="clear" w:color="auto" w:fill="1A1A1A"/>
             <w:tcMar>
               <w:top w:w="80" w:type="dxa"/>
               <w:bottom w:w="80" w:type="dxa"/>
@@ -4837,7 +4837,7 @@
           <w:tcPr>
             <w:tcW w:type="dxa" w:w="3216"/>
             <w:vAlign w:val="center"/>
-            <w:shd w:val="clear" w:color="auto" w:fill="0F766E"/>
+            <w:shd w:val="clear" w:color="auto" w:fill="1A1A1A"/>
             <w:tcMar>
               <w:top w:w="80" w:type="dxa"/>
               <w:bottom w:w="80" w:type="dxa"/>
@@ -4959,7 +4959,7 @@
           <w:tcPr>
             <w:tcW w:type="dxa" w:w="3216"/>
             <w:vAlign w:val="center"/>
-            <w:shd w:val="clear" w:color="auto" w:fill="ECFEFF"/>
+            <w:shd w:val="clear" w:color="auto" w:fill="F2F2F2"/>
             <w:tcMar>
               <w:top w:w="80" w:type="dxa"/>
               <w:bottom w:w="80" w:type="dxa"/>
@@ -4988,7 +4988,7 @@
           <w:tcPr>
             <w:tcW w:type="dxa" w:w="3216"/>
             <w:vAlign w:val="center"/>
-            <w:shd w:val="clear" w:color="auto" w:fill="ECFEFF"/>
+            <w:shd w:val="clear" w:color="auto" w:fill="F2F2F2"/>
             <w:tcMar>
               <w:top w:w="80" w:type="dxa"/>
               <w:bottom w:w="80" w:type="dxa"/>
@@ -5018,7 +5018,7 @@
           <w:tcPr>
             <w:tcW w:type="dxa" w:w="3216"/>
             <w:vAlign w:val="center"/>
-            <w:shd w:val="clear" w:color="auto" w:fill="ECFEFF"/>
+            <w:shd w:val="clear" w:color="auto" w:fill="F2F2F2"/>
             <w:tcMar>
               <w:top w:w="80" w:type="dxa"/>
               <w:bottom w:w="80" w:type="dxa"/>
@@ -5136,7 +5136,7 @@
           <w:tcPr>
             <w:tcW w:type="dxa" w:w="3216"/>
             <w:vAlign w:val="center"/>
-            <w:shd w:val="clear" w:color="auto" w:fill="ECFEFF"/>
+            <w:shd w:val="clear" w:color="auto" w:fill="F2F2F2"/>
             <w:tcMar>
               <w:top w:w="80" w:type="dxa"/>
               <w:bottom w:w="80" w:type="dxa"/>
@@ -5165,7 +5165,7 @@
           <w:tcPr>
             <w:tcW w:type="dxa" w:w="3216"/>
             <w:vAlign w:val="center"/>
-            <w:shd w:val="clear" w:color="auto" w:fill="ECFEFF"/>
+            <w:shd w:val="clear" w:color="auto" w:fill="F2F2F2"/>
             <w:tcMar>
               <w:top w:w="80" w:type="dxa"/>
               <w:bottom w:w="80" w:type="dxa"/>
@@ -5195,7 +5195,7 @@
           <w:tcPr>
             <w:tcW w:type="dxa" w:w="3216"/>
             <w:vAlign w:val="center"/>
-            <w:shd w:val="clear" w:color="auto" w:fill="ECFEFF"/>
+            <w:shd w:val="clear" w:color="auto" w:fill="F2F2F2"/>
             <w:tcMar>
               <w:top w:w="80" w:type="dxa"/>
               <w:bottom w:w="80" w:type="dxa"/>
@@ -5342,7 +5342,7 @@
       </w:pPr>
       <w:r>
         <w:rPr>
-          <w:color w:val="B45309"/>
+          <w:color w:val="3C3C3C"/>
         </w:rPr>
         <w:t>4.5 Figures</w:t>
       </w:r>
@@ -5457,7 +5457,7 @@
       </w:pPr>
       <w:r>
         <w:rPr>
-          <w:color w:val="0F766E"/>
+          <w:color w:val="141414"/>
         </w:rPr>
         <w:t>5. Discussion</w:t>
       </w:r>
@@ -5468,7 +5468,7 @@
       </w:pPr>
       <w:r>
         <w:rPr>
-          <w:color w:val="B45309"/>
+          <w:color w:val="3C3C3C"/>
         </w:rPr>
         <w:t>5.1 Why all three models reach the ceiling</w:t>
       </w:r>
@@ -5522,7 +5522,7 @@
       </w:pPr>
       <w:r>
         <w:rPr>
-          <w:color w:val="B45309"/>
+          <w:color w:val="3C3C3C"/>
         </w:rPr>
         <w:t>5.2 What the feature importances tell us</w:t>
       </w:r>
@@ -5591,7 +5591,7 @@
       </w:pPr>
       <w:r>
         <w:rPr>
-          <w:color w:val="B45309"/>
+          <w:color w:val="3C3C3C"/>
         </w:rPr>
         <w:t>5.3 Limitations</w:t>
       </w:r>
@@ -5662,7 +5662,7 @@
       </w:pPr>
       <w:r>
         <w:rPr>
-          <w:color w:val="B45309"/>
+          <w:color w:val="3C3C3C"/>
         </w:rPr>
         <w:t>5.4 Engineering decisions worth noting</w:t>
       </w:r>
@@ -5726,7 +5726,7 @@
       </w:pPr>
       <w:r>
         <w:rPr>
-          <w:color w:val="0F766E"/>
+          <w:color w:val="141414"/>
         </w:rPr>
         <w:t>6. Comparison with Other Research Papers</w:t>
       </w:r>
@@ -5737,7 +5737,7 @@
       </w:pPr>
       <w:r>
         <w:rPr>
-          <w:color w:val="B45309"/>
+          <w:color w:val="3C3C3C"/>
         </w:rPr>
         <w:t>6.1 Comparison on the same task (spoof / decoy attribution)</w:t>
       </w:r>
@@ -5748,12 +5748,12 @@
         <w:tblLayout w:type="autofit"/>
         <w:tblLook w:firstColumn="1" w:firstRow="1" w:lastColumn="0" w:lastRow="0" w:noHBand="0" w:noVBand="1" w:val="04A0"/>
         <w:tblBorders>
-          <w:top w:val="single" w:sz="6" w:space="0" w:color="5EEAD4"/>
-          <w:left w:val="single" w:sz="6" w:space="0" w:color="5EEAD4"/>
-          <w:bottom w:val="single" w:sz="6" w:space="0" w:color="5EEAD4"/>
-          <w:right w:val="single" w:sz="6" w:space="0" w:color="5EEAD4"/>
-          <w:insideH w:val="single" w:sz="6" w:space="0" w:color="5EEAD4"/>
-          <w:insideV w:val="single" w:sz="6" w:space="0" w:color="5EEAD4"/>
+          <w:top w:val="single" w:sz="6" w:space="0" w:color="BFBFBF"/>
+          <w:left w:val="single" w:sz="6" w:space="0" w:color="BFBFBF"/>
+          <w:bottom w:val="single" w:sz="6" w:space="0" w:color="BFBFBF"/>
+          <w:right w:val="single" w:sz="6" w:space="0" w:color="BFBFBF"/>
+          <w:insideH w:val="single" w:sz="6" w:space="0" w:color="BFBFBF"/>
+          <w:insideV w:val="single" w:sz="6" w:space="0" w:color="BFBFBF"/>
         </w:tblBorders>
       </w:tblPr>
       <w:tblGrid>
@@ -5768,7 +5768,7 @@
           <w:tcPr>
             <w:tcW w:type="dxa" w:w="1930"/>
             <w:vAlign w:val="center"/>
-            <w:shd w:val="clear" w:color="auto" w:fill="0F766E"/>
+            <w:shd w:val="clear" w:color="auto" w:fill="1A1A1A"/>
             <w:tcMar>
               <w:top w:w="80" w:type="dxa"/>
               <w:bottom w:w="80" w:type="dxa"/>
@@ -5801,7 +5801,7 @@
           <w:tcPr>
             <w:tcW w:type="dxa" w:w="1930"/>
             <w:vAlign w:val="center"/>
-            <w:shd w:val="clear" w:color="auto" w:fill="0F766E"/>
+            <w:shd w:val="clear" w:color="auto" w:fill="1A1A1A"/>
             <w:tcMar>
               <w:top w:w="80" w:type="dxa"/>
               <w:bottom w:w="80" w:type="dxa"/>
@@ -5834,7 +5834,7 @@
           <w:tcPr>
             <w:tcW w:type="dxa" w:w="1930"/>
             <w:vAlign w:val="center"/>
-            <w:shd w:val="clear" w:color="auto" w:fill="0F766E"/>
+            <w:shd w:val="clear" w:color="auto" w:fill="1A1A1A"/>
             <w:tcMar>
               <w:top w:w="80" w:type="dxa"/>
               <w:bottom w:w="80" w:type="dxa"/>
@@ -5867,7 +5867,7 @@
           <w:tcPr>
             <w:tcW w:type="dxa" w:w="1930"/>
             <w:vAlign w:val="center"/>
-            <w:shd w:val="clear" w:color="auto" w:fill="0F766E"/>
+            <w:shd w:val="clear" w:color="auto" w:fill="1A1A1A"/>
             <w:tcMar>
               <w:top w:w="80" w:type="dxa"/>
               <w:bottom w:w="80" w:type="dxa"/>
@@ -5900,7 +5900,7 @@
           <w:tcPr>
             <w:tcW w:type="dxa" w:w="1930"/>
             <w:vAlign w:val="center"/>
-            <w:shd w:val="clear" w:color="auto" w:fill="0F766E"/>
+            <w:shd w:val="clear" w:color="auto" w:fill="1A1A1A"/>
             <w:tcMar>
               <w:top w:w="80" w:type="dxa"/>
               <w:bottom w:w="80" w:type="dxa"/>
@@ -6084,7 +6084,7 @@
           <w:tcPr>
             <w:tcW w:type="dxa" w:w="1930"/>
             <w:vAlign w:val="center"/>
-            <w:shd w:val="clear" w:color="auto" w:fill="ECFEFF"/>
+            <w:shd w:val="clear" w:color="auto" w:fill="F2F2F2"/>
             <w:tcMar>
               <w:top w:w="80" w:type="dxa"/>
               <w:bottom w:w="80" w:type="dxa"/>
@@ -6120,7 +6120,7 @@
           <w:tcPr>
             <w:tcW w:type="dxa" w:w="1930"/>
             <w:vAlign w:val="center"/>
-            <w:shd w:val="clear" w:color="auto" w:fill="ECFEFF"/>
+            <w:shd w:val="clear" w:color="auto" w:fill="F2F2F2"/>
             <w:tcMar>
               <w:top w:w="80" w:type="dxa"/>
               <w:bottom w:w="80" w:type="dxa"/>
@@ -6149,7 +6149,7 @@
           <w:tcPr>
             <w:tcW w:type="dxa" w:w="1930"/>
             <w:vAlign w:val="center"/>
-            <w:shd w:val="clear" w:color="auto" w:fill="ECFEFF"/>
+            <w:shd w:val="clear" w:color="auto" w:fill="F2F2F2"/>
             <w:tcMar>
               <w:top w:w="80" w:type="dxa"/>
               <w:bottom w:w="80" w:type="dxa"/>
@@ -6178,7 +6178,7 @@
           <w:tcPr>
             <w:tcW w:type="dxa" w:w="1930"/>
             <w:vAlign w:val="center"/>
-            <w:shd w:val="clear" w:color="auto" w:fill="ECFEFF"/>
+            <w:shd w:val="clear" w:color="auto" w:fill="F2F2F2"/>
             <w:tcMar>
               <w:top w:w="80" w:type="dxa"/>
               <w:bottom w:w="80" w:type="dxa"/>
@@ -6207,7 +6207,7 @@
           <w:tcPr>
             <w:tcW w:type="dxa" w:w="1930"/>
             <w:vAlign w:val="center"/>
-            <w:shd w:val="clear" w:color="auto" w:fill="ECFEFF"/>
+            <w:shd w:val="clear" w:color="auto" w:fill="F2F2F2"/>
             <w:tcMar>
               <w:top w:w="80" w:type="dxa"/>
               <w:bottom w:w="80" w:type="dxa"/>
@@ -6387,7 +6387,7 @@
           <w:tcPr>
             <w:tcW w:type="dxa" w:w="1930"/>
             <w:vAlign w:val="center"/>
-            <w:shd w:val="clear" w:color="auto" w:fill="ECFEFF"/>
+            <w:shd w:val="clear" w:color="auto" w:fill="F2F2F2"/>
             <w:tcMar>
               <w:top w:w="80" w:type="dxa"/>
               <w:bottom w:w="80" w:type="dxa"/>
@@ -6423,7 +6423,7 @@
           <w:tcPr>
             <w:tcW w:type="dxa" w:w="1930"/>
             <w:vAlign w:val="center"/>
-            <w:shd w:val="clear" w:color="auto" w:fill="ECFEFF"/>
+            <w:shd w:val="clear" w:color="auto" w:fill="F2F2F2"/>
             <w:tcMar>
               <w:top w:w="80" w:type="dxa"/>
               <w:bottom w:w="80" w:type="dxa"/>
@@ -6452,7 +6452,7 @@
           <w:tcPr>
             <w:tcW w:type="dxa" w:w="1930"/>
             <w:vAlign w:val="center"/>
-            <w:shd w:val="clear" w:color="auto" w:fill="ECFEFF"/>
+            <w:shd w:val="clear" w:color="auto" w:fill="F2F2F2"/>
             <w:tcMar>
               <w:top w:w="80" w:type="dxa"/>
               <w:bottom w:w="80" w:type="dxa"/>
@@ -6481,7 +6481,7 @@
           <w:tcPr>
             <w:tcW w:type="dxa" w:w="1930"/>
             <w:vAlign w:val="center"/>
-            <w:shd w:val="clear" w:color="auto" w:fill="ECFEFF"/>
+            <w:shd w:val="clear" w:color="auto" w:fill="F2F2F2"/>
             <w:tcMar>
               <w:top w:w="80" w:type="dxa"/>
               <w:bottom w:w="80" w:type="dxa"/>
@@ -6510,7 +6510,7 @@
           <w:tcPr>
             <w:tcW w:type="dxa" w:w="1930"/>
             <w:vAlign w:val="center"/>
-            <w:shd w:val="clear" w:color="auto" w:fill="ECFEFF"/>
+            <w:shd w:val="clear" w:color="auto" w:fill="F2F2F2"/>
             <w:tcMar>
               <w:top w:w="80" w:type="dxa"/>
               <w:bottom w:w="80" w:type="dxa"/>
@@ -6687,7 +6687,7 @@
           <w:tcPr>
             <w:tcW w:type="dxa" w:w="1930"/>
             <w:vAlign w:val="center"/>
-            <w:shd w:val="clear" w:color="auto" w:fill="ECFEFF"/>
+            <w:shd w:val="clear" w:color="auto" w:fill="F2F2F2"/>
             <w:tcMar>
               <w:top w:w="80" w:type="dxa"/>
               <w:bottom w:w="80" w:type="dxa"/>
@@ -6717,7 +6717,7 @@
           <w:tcPr>
             <w:tcW w:type="dxa" w:w="1930"/>
             <w:vAlign w:val="center"/>
-            <w:shd w:val="clear" w:color="auto" w:fill="ECFEFF"/>
+            <w:shd w:val="clear" w:color="auto" w:fill="F2F2F2"/>
             <w:tcMar>
               <w:top w:w="80" w:type="dxa"/>
               <w:bottom w:w="80" w:type="dxa"/>
@@ -6746,7 +6746,7 @@
           <w:tcPr>
             <w:tcW w:type="dxa" w:w="1930"/>
             <w:vAlign w:val="center"/>
-            <w:shd w:val="clear" w:color="auto" w:fill="ECFEFF"/>
+            <w:shd w:val="clear" w:color="auto" w:fill="F2F2F2"/>
             <w:tcMar>
               <w:top w:w="80" w:type="dxa"/>
               <w:bottom w:w="80" w:type="dxa"/>
@@ -6776,7 +6776,7 @@
           <w:tcPr>
             <w:tcW w:type="dxa" w:w="1930"/>
             <w:vAlign w:val="center"/>
-            <w:shd w:val="clear" w:color="auto" w:fill="ECFEFF"/>
+            <w:shd w:val="clear" w:color="auto" w:fill="F2F2F2"/>
             <w:tcMar>
               <w:top w:w="80" w:type="dxa"/>
               <w:bottom w:w="80" w:type="dxa"/>
@@ -6805,7 +6805,7 @@
           <w:tcPr>
             <w:tcW w:type="dxa" w:w="1930"/>
             <w:vAlign w:val="center"/>
-            <w:shd w:val="clear" w:color="auto" w:fill="ECFEFF"/>
+            <w:shd w:val="clear" w:color="auto" w:fill="F2F2F2"/>
             <w:tcMar>
               <w:top w:w="80" w:type="dxa"/>
               <w:bottom w:w="80" w:type="dxa"/>
@@ -7000,7 +7000,7 @@
       </w:pPr>
       <w:r>
         <w:rPr>
-          <w:color w:val="B45309"/>
+          <w:color w:val="3C3C3C"/>
         </w:rPr>
         <w:t>6.2 Comparison with classic anti-spoofing defences</w:t>
       </w:r>
@@ -7011,12 +7011,12 @@
         <w:tblLayout w:type="autofit"/>
         <w:tblLook w:firstColumn="1" w:firstRow="1" w:lastColumn="0" w:lastRow="0" w:noHBand="0" w:noVBand="1" w:val="04A0"/>
         <w:tblBorders>
-          <w:top w:val="single" w:sz="6" w:space="0" w:color="5EEAD4"/>
-          <w:left w:val="single" w:sz="6" w:space="0" w:color="5EEAD4"/>
-          <w:bottom w:val="single" w:sz="6" w:space="0" w:color="5EEAD4"/>
-          <w:right w:val="single" w:sz="6" w:space="0" w:color="5EEAD4"/>
-          <w:insideH w:val="single" w:sz="6" w:space="0" w:color="5EEAD4"/>
-          <w:insideV w:val="single" w:sz="6" w:space="0" w:color="5EEAD4"/>
+          <w:top w:val="single" w:sz="6" w:space="0" w:color="BFBFBF"/>
+          <w:left w:val="single" w:sz="6" w:space="0" w:color="BFBFBF"/>
+          <w:bottom w:val="single" w:sz="6" w:space="0" w:color="BFBFBF"/>
+          <w:right w:val="single" w:sz="6" w:space="0" w:color="BFBFBF"/>
+          <w:insideH w:val="single" w:sz="6" w:space="0" w:color="BFBFBF"/>
+          <w:insideV w:val="single" w:sz="6" w:space="0" w:color="BFBFBF"/>
         </w:tblBorders>
       </w:tblPr>
       <w:tblGrid>
@@ -7030,7 +7030,7 @@
           <w:tcPr>
             <w:tcW w:type="dxa" w:w="2412"/>
             <w:vAlign w:val="center"/>
-            <w:shd w:val="clear" w:color="auto" w:fill="0F766E"/>
+            <w:shd w:val="clear" w:color="auto" w:fill="1A1A1A"/>
             <w:tcMar>
               <w:top w:w="80" w:type="dxa"/>
               <w:bottom w:w="80" w:type="dxa"/>
@@ -7063,7 +7063,7 @@
           <w:tcPr>
             <w:tcW w:type="dxa" w:w="2412"/>
             <w:vAlign w:val="center"/>
-            <w:shd w:val="clear" w:color="auto" w:fill="0F766E"/>
+            <w:shd w:val="clear" w:color="auto" w:fill="1A1A1A"/>
             <w:tcMar>
               <w:top w:w="80" w:type="dxa"/>
               <w:bottom w:w="80" w:type="dxa"/>
@@ -7096,7 +7096,7 @@
           <w:tcPr>
             <w:tcW w:type="dxa" w:w="2412"/>
             <w:vAlign w:val="center"/>
-            <w:shd w:val="clear" w:color="auto" w:fill="0F766E"/>
+            <w:shd w:val="clear" w:color="auto" w:fill="1A1A1A"/>
             <w:tcMar>
               <w:top w:w="80" w:type="dxa"/>
               <w:bottom w:w="80" w:type="dxa"/>
@@ -7129,7 +7129,7 @@
           <w:tcPr>
             <w:tcW w:type="dxa" w:w="2412"/>
             <w:vAlign w:val="center"/>
-            <w:shd w:val="clear" w:color="auto" w:fill="0F766E"/>
+            <w:shd w:val="clear" w:color="auto" w:fill="1A1A1A"/>
             <w:tcMar>
               <w:top w:w="80" w:type="dxa"/>
               <w:bottom w:w="80" w:type="dxa"/>
@@ -7278,7 +7278,7 @@
           <w:tcPr>
             <w:tcW w:type="dxa" w:w="2412"/>
             <w:vAlign w:val="center"/>
-            <w:shd w:val="clear" w:color="auto" w:fill="ECFEFF"/>
+            <w:shd w:val="clear" w:color="auto" w:fill="F2F2F2"/>
             <w:tcMar>
               <w:top w:w="80" w:type="dxa"/>
               <w:bottom w:w="80" w:type="dxa"/>
@@ -7307,7 +7307,7 @@
           <w:tcPr>
             <w:tcW w:type="dxa" w:w="2412"/>
             <w:vAlign w:val="center"/>
-            <w:shd w:val="clear" w:color="auto" w:fill="ECFEFF"/>
+            <w:shd w:val="clear" w:color="auto" w:fill="F2F2F2"/>
             <w:tcMar>
               <w:top w:w="80" w:type="dxa"/>
               <w:bottom w:w="80" w:type="dxa"/>
@@ -7336,7 +7336,7 @@
           <w:tcPr>
             <w:tcW w:type="dxa" w:w="2412"/>
             <w:vAlign w:val="center"/>
-            <w:shd w:val="clear" w:color="auto" w:fill="ECFEFF"/>
+            <w:shd w:val="clear" w:color="auto" w:fill="F2F2F2"/>
             <w:tcMar>
               <w:top w:w="80" w:type="dxa"/>
               <w:bottom w:w="80" w:type="dxa"/>
@@ -7365,7 +7365,7 @@
           <w:tcPr>
             <w:tcW w:type="dxa" w:w="2412"/>
             <w:vAlign w:val="center"/>
-            <w:shd w:val="clear" w:color="auto" w:fill="ECFEFF"/>
+            <w:shd w:val="clear" w:color="auto" w:fill="F2F2F2"/>
             <w:tcMar>
               <w:top w:w="80" w:type="dxa"/>
               <w:bottom w:w="80" w:type="dxa"/>
@@ -7514,7 +7514,7 @@
       </w:pPr>
       <w:r>
         <w:rPr>
-          <w:color w:val="B45309"/>
+          <w:color w:val="3C3C3C"/>
         </w:rPr>
         <w:t>6.3 Trees vs. Deep Learning — what the field settled on</w:t>
       </w:r>
@@ -7559,7 +7559,7 @@
       </w:pPr>
       <w:r>
         <w:rPr>
-          <w:color w:val="0F766E"/>
+          <w:color w:val="141414"/>
         </w:rPr>
         <w:t>7. Conclusion</w:t>
       </w:r>
@@ -7626,7 +7626,7 @@
       </w:pPr>
       <w:r>
         <w:rPr>
-          <w:color w:val="B45309"/>
+          <w:color w:val="3C3C3C"/>
         </w:rPr>
         <w:t>Future work</w:t>
       </w:r>
@@ -7720,7 +7720,7 @@
       </w:pPr>
       <w:r>
         <w:rPr>
-          <w:color w:val="0F766E"/>
+          <w:color w:val="141414"/>
         </w:rPr>
         <w:t>8. References</w:t>
       </w:r>

</xml_diff>